<commit_message>
feat: initialize library, update session materials, and add course evaluation documentation
</commit_message>
<xml_diff>
--- a/00-Curso/Plan_Curso_Teledeteccion_MiguelPolo_1.docx
+++ b/00-Curso/Plan_Curso_Teledeteccion_MiguelPolo_1.docx
@@ -8688,7 +8688,7 @@
         <w:spacing w:before="60" w:after="60"/>
       </w:pPr>
       <w:r>
-        <w:t>La evaluación combina las tres estrategias del microdiseño: heteroevaluación (proyecto final presentado), autoevaluación (reflexión permanente) y coevaluación (trabajo en grupo). Todo está alineado con los criterios del Formato GA-F-003.</w:t>
+        <w:t>La evaluación combina las tres estrategias del microdiseño: heteroevaluación (artículo científico y presentación final), autoevaluación (reflexión permanente) y coevaluación (trabajo en grupo en los laboratorios). Todo está alineado con los criterios del Formato GA-F-003. El peso se concentra en los dos entregables que demuestran dominio integrado (presentación y artículo), y los laboratorios pasan a tener un rol formativo de bajo peso. Ver detalle completo en 00-Curso/evaluacion_v2.md.</w:t>
       </w:r>
     </w:p>
     <w:p>
@@ -8832,301 +8832,129 @@
         </w:tc>
       </w:tr>
       <w:tr>
-        <w:tblPrEx>
-          <w:tblCellMar>
-            <w:top w:w="0" w:type="dxa"/>
-            <w:bottom w:w="0" w:type="dxa"/>
-          </w:tblCellMar>
-        </w:tblPrEx>
-        <w:tc>
-          <w:tcPr>
-            <w:tcW w:w="3000" w:type="dxa"/>
-            <w:tcBorders>
-              <w:top w:val="single" w:sz="1" w:space="0" w:color="CCCCCC"/>
-              <w:left w:val="single" w:sz="1" w:space="0" w:color="CCCCCC"/>
-              <w:bottom w:val="single" w:sz="1" w:space="0" w:color="CCCCCC"/>
-              <w:right w:val="single" w:sz="1" w:space="0" w:color="CCCCCC"/>
-            </w:tcBorders>
-            <w:shd w:val="clear" w:color="auto" w:fill="F2F2F2"/>
-            <w:tcMar>
-              <w:top w:w="60" w:type="dxa"/>
-              <w:left w:w="120" w:type="dxa"/>
-              <w:bottom w:w="60" w:type="dxa"/>
-              <w:right w:w="120" w:type="dxa"/>
-            </w:tcMar>
-            <w:vAlign w:val="center"/>
-          </w:tcPr>
-          <w:p>
-            <w:r>
-              <w:rPr>
-                <w:color w:val="000000"/>
-                <w:sz w:val="20"/>
-                <w:szCs w:val="20"/>
-              </w:rPr>
+        <w:tc>
+          <w:tcPr>
+            <w:tcW w:type="dxa" w:w="3000"/>
+          </w:tcPr>
+          <w:p>
+            <w:r>
               <w:t>Participación &amp; Prácticas (S1–S5)</w:t>
             </w:r>
           </w:p>
         </w:tc>
         <w:tc>
           <w:tcPr>
-            <w:tcW w:w="2800" w:type="dxa"/>
-            <w:tcBorders>
-              <w:top w:val="single" w:sz="1" w:space="0" w:color="CCCCCC"/>
-              <w:left w:val="single" w:sz="1" w:space="0" w:color="CCCCCC"/>
-              <w:bottom w:val="single" w:sz="1" w:space="0" w:color="CCCCCC"/>
-              <w:right w:val="single" w:sz="1" w:space="0" w:color="CCCCCC"/>
-            </w:tcBorders>
-            <w:shd w:val="clear" w:color="auto" w:fill="F2F2F2"/>
-            <w:tcMar>
-              <w:top w:w="60" w:type="dxa"/>
-              <w:left w:w="120" w:type="dxa"/>
-              <w:bottom w:w="60" w:type="dxa"/>
-              <w:right w:w="120" w:type="dxa"/>
-            </w:tcMar>
-            <w:vAlign w:val="center"/>
-          </w:tcPr>
-          <w:p>
-            <w:pPr>
-              <w:jc w:val="center"/>
-            </w:pPr>
-            <w:r>
-              <w:rPr>
-                <w:b/>
-                <w:bCs/>
-                <w:color w:val="000000"/>
-                <w:sz w:val="20"/>
-                <w:szCs w:val="20"/>
-              </w:rPr>
-              <w:t>30%</w:t>
-            </w:r>
-          </w:p>
-        </w:tc>
-        <w:tc>
-          <w:tcPr>
-            <w:tcW w:w="3560" w:type="dxa"/>
-            <w:tcBorders>
-              <w:top w:val="single" w:sz="1" w:space="0" w:color="CCCCCC"/>
-              <w:left w:val="single" w:sz="1" w:space="0" w:color="CCCCCC"/>
-              <w:bottom w:val="single" w:sz="1" w:space="0" w:color="CCCCCC"/>
-              <w:right w:val="single" w:sz="1" w:space="0" w:color="CCCCCC"/>
-            </w:tcBorders>
-            <w:shd w:val="clear" w:color="auto" w:fill="F2F2F2"/>
-            <w:tcMar>
-              <w:top w:w="60" w:type="dxa"/>
-              <w:left w:w="120" w:type="dxa"/>
-              <w:bottom w:w="60" w:type="dxa"/>
-              <w:right w:w="120" w:type="dxa"/>
-            </w:tcMar>
-            <w:vAlign w:val="center"/>
-          </w:tcPr>
-          <w:p>
-            <w:r>
-              <w:rPr>
-                <w:color w:val="000000"/>
-                <w:sz w:val="20"/>
-                <w:szCs w:val="20"/>
-              </w:rPr>
-              <w:t>Entrega de ejercicios de cada laboratorio (formato notebook o reporte PDF)</w:t>
+            <w:tcW w:type="dxa" w:w="2800"/>
+          </w:tcPr>
+          <w:p>
+            <w:r>
+              <w:t>10%</w:t>
+            </w:r>
+          </w:p>
+        </w:tc>
+        <w:tc>
+          <w:tcPr>
+            <w:tcW w:type="dxa" w:w="3560"/>
+          </w:tcPr>
+          <w:p>
+            <w:r>
+              <w:t>Entrega de ejercicios de cada laboratorio (formato notebook o reporte PDF). Parejas permitidas.</w:t>
             </w:r>
           </w:p>
         </w:tc>
       </w:tr>
       <w:tr>
-        <w:tblPrEx>
-          <w:tblCellMar>
-            <w:top w:w="0" w:type="dxa"/>
-            <w:bottom w:w="0" w:type="dxa"/>
-          </w:tblCellMar>
-        </w:tblPrEx>
-        <w:tc>
-          <w:tcPr>
-            <w:tcW w:w="3000" w:type="dxa"/>
-            <w:tcBorders>
-              <w:top w:val="single" w:sz="1" w:space="0" w:color="CCCCCC"/>
-              <w:left w:val="single" w:sz="1" w:space="0" w:color="CCCCCC"/>
-              <w:bottom w:val="single" w:sz="1" w:space="0" w:color="CCCCCC"/>
-              <w:right w:val="single" w:sz="1" w:space="0" w:color="CCCCCC"/>
-            </w:tcBorders>
-            <w:shd w:val="clear" w:color="auto" w:fill="FFFFFF"/>
-            <w:tcMar>
-              <w:top w:w="60" w:type="dxa"/>
-              <w:left w:w="120" w:type="dxa"/>
-              <w:bottom w:w="60" w:type="dxa"/>
-              <w:right w:w="120" w:type="dxa"/>
-            </w:tcMar>
-            <w:vAlign w:val="center"/>
-          </w:tcPr>
-          <w:p>
-            <w:r>
-              <w:rPr>
-                <w:color w:val="000000"/>
-                <w:sz w:val="20"/>
-                <w:szCs w:val="20"/>
-              </w:rPr>
+        <w:tc>
+          <w:tcPr>
+            <w:tcW w:type="dxa" w:w="3000"/>
+          </w:tcPr>
+          <w:p>
+            <w:r>
               <w:t>Propuesta de proyecto (S4)</w:t>
             </w:r>
           </w:p>
         </w:tc>
         <w:tc>
           <w:tcPr>
-            <w:tcW w:w="2800" w:type="dxa"/>
-            <w:tcBorders>
-              <w:top w:val="single" w:sz="1" w:space="0" w:color="CCCCCC"/>
-              <w:left w:val="single" w:sz="1" w:space="0" w:color="CCCCCC"/>
-              <w:bottom w:val="single" w:sz="1" w:space="0" w:color="CCCCCC"/>
-              <w:right w:val="single" w:sz="1" w:space="0" w:color="CCCCCC"/>
-            </w:tcBorders>
-            <w:shd w:val="clear" w:color="auto" w:fill="FFFFFF"/>
-            <w:tcMar>
-              <w:top w:w="60" w:type="dxa"/>
-              <w:left w:w="120" w:type="dxa"/>
-              <w:bottom w:w="60" w:type="dxa"/>
-              <w:right w:w="120" w:type="dxa"/>
-            </w:tcMar>
-            <w:vAlign w:val="center"/>
-          </w:tcPr>
-          <w:p>
-            <w:pPr>
-              <w:jc w:val="center"/>
-            </w:pPr>
-            <w:r>
-              <w:rPr>
-                <w:b/>
-                <w:bCs/>
-                <w:color w:val="000000"/>
-                <w:sz w:val="20"/>
-                <w:szCs w:val="20"/>
-              </w:rPr>
-              <w:t>20%</w:t>
-            </w:r>
-          </w:p>
-        </w:tc>
-        <w:tc>
-          <w:tcPr>
-            <w:tcW w:w="3560" w:type="dxa"/>
-            <w:tcBorders>
-              <w:top w:val="single" w:sz="1" w:space="0" w:color="CCCCCC"/>
-              <w:left w:val="single" w:sz="1" w:space="0" w:color="CCCCCC"/>
-              <w:bottom w:val="single" w:sz="1" w:space="0" w:color="CCCCCC"/>
-              <w:right w:val="single" w:sz="1" w:space="0" w:color="CCCCCC"/>
-            </w:tcBorders>
-            <w:shd w:val="clear" w:color="auto" w:fill="FFFFFF"/>
-            <w:tcMar>
-              <w:top w:w="60" w:type="dxa"/>
-              <w:left w:w="120" w:type="dxa"/>
-              <w:bottom w:w="60" w:type="dxa"/>
-              <w:right w:w="120" w:type="dxa"/>
-            </w:tcMar>
-            <w:vAlign w:val="center"/>
-          </w:tcPr>
-          <w:p>
-            <w:r>
-              <w:rPr>
-                <w:color w:val="000000"/>
-                <w:sz w:val="20"/>
-                <w:szCs w:val="20"/>
-              </w:rPr>
-              <w:t>1 página: área de estudio, pregunta de investigación, datos, herramienta seleccionada</w:t>
+            <w:tcW w:type="dxa" w:w="2800"/>
+          </w:tcPr>
+          <w:p>
+            <w:r>
+              <w:t>15%</w:t>
+            </w:r>
+          </w:p>
+        </w:tc>
+        <w:tc>
+          <w:tcPr>
+            <w:tcW w:type="dxa" w:w="3560"/>
+          </w:tcPr>
+          <w:p>
+            <w:r>
+              <w:t>1 página: área de estudio, pregunta de investigación, datos, herramienta seleccionada. Individual.</w:t>
             </w:r>
           </w:p>
         </w:tc>
       </w:tr>
       <w:tr>
-        <w:tblPrEx>
-          <w:tblCellMar>
-            <w:top w:w="0" w:type="dxa"/>
-            <w:bottom w:w="0" w:type="dxa"/>
-          </w:tblCellMar>
-        </w:tblPrEx>
-        <w:tc>
-          <w:tcPr>
-            <w:tcW w:w="3000" w:type="dxa"/>
-            <w:tcBorders>
-              <w:top w:val="single" w:sz="1" w:space="0" w:color="CCCCCC"/>
-              <w:left w:val="single" w:sz="1" w:space="0" w:color="CCCCCC"/>
-              <w:bottom w:val="single" w:sz="1" w:space="0" w:color="CCCCCC"/>
-              <w:right w:val="single" w:sz="1" w:space="0" w:color="CCCCCC"/>
-            </w:tcBorders>
-            <w:shd w:val="clear" w:color="auto" w:fill="D9F0E5"/>
-            <w:tcMar>
-              <w:top w:w="60" w:type="dxa"/>
-              <w:left w:w="120" w:type="dxa"/>
-              <w:bottom w:w="60" w:type="dxa"/>
-              <w:right w:w="120" w:type="dxa"/>
-            </w:tcMar>
-            <w:vAlign w:val="center"/>
-          </w:tcPr>
-          <w:p>
-            <w:r>
-              <w:rPr>
-                <w:color w:val="000000"/>
-                <w:sz w:val="20"/>
-                <w:szCs w:val="20"/>
-              </w:rPr>
-              <w:t>Proyecto Final + Presentación (S6)</w:t>
-            </w:r>
-          </w:p>
-        </w:tc>
-        <w:tc>
-          <w:tcPr>
-            <w:tcW w:w="2800" w:type="dxa"/>
-            <w:tcBorders>
-              <w:top w:val="single" w:sz="1" w:space="0" w:color="CCCCCC"/>
-              <w:left w:val="single" w:sz="1" w:space="0" w:color="CCCCCC"/>
-              <w:bottom w:val="single" w:sz="1" w:space="0" w:color="CCCCCC"/>
-              <w:right w:val="single" w:sz="1" w:space="0" w:color="CCCCCC"/>
-            </w:tcBorders>
-            <w:shd w:val="clear" w:color="auto" w:fill="D9F0E5"/>
-            <w:tcMar>
-              <w:top w:w="60" w:type="dxa"/>
-              <w:left w:w="120" w:type="dxa"/>
-              <w:bottom w:w="60" w:type="dxa"/>
-              <w:right w:w="120" w:type="dxa"/>
-            </w:tcMar>
-            <w:vAlign w:val="center"/>
-          </w:tcPr>
-          <w:p>
-            <w:pPr>
-              <w:jc w:val="center"/>
-            </w:pPr>
-            <w:r>
-              <w:rPr>
-                <w:b/>
-                <w:bCs/>
-                <w:color w:val="1E6B3F"/>
-                <w:sz w:val="20"/>
-                <w:szCs w:val="20"/>
-              </w:rPr>
+        <w:tc>
+          <w:tcPr>
+            <w:tcW w:type="dxa" w:w="3000"/>
+          </w:tcPr>
+          <w:p>
+            <w:r>
+              <w:t>Presentación final (S6)</w:t>
+            </w:r>
+          </w:p>
+        </w:tc>
+        <w:tc>
+          <w:tcPr>
+            <w:tcW w:type="dxa" w:w="2800"/>
+          </w:tcPr>
+          <w:p>
+            <w:r>
+              <w:t>25%</w:t>
+            </w:r>
+          </w:p>
+        </w:tc>
+        <w:tc>
+          <w:tcPr>
+            <w:tcW w:type="dxa" w:w="3560"/>
+          </w:tcPr>
+          <w:p>
+            <w:r>
+              <w:t>Oral, 5 min + 5 min de preguntas. Individual.</w:t>
+            </w:r>
+          </w:p>
+        </w:tc>
+      </w:tr>
+      <w:tr>
+        <w:tc>
+          <w:tcPr>
+            <w:tcW w:type="dxa" w:w="3000"/>
+          </w:tcPr>
+          <w:p>
+            <w:r>
+              <w:t>Artículo científico</w:t>
+            </w:r>
+          </w:p>
+        </w:tc>
+        <w:tc>
+          <w:tcPr>
+            <w:tcW w:type="dxa" w:w="2800"/>
+          </w:tcPr>
+          <w:p>
+            <w:r>
               <w:t>50%</w:t>
             </w:r>
           </w:p>
         </w:tc>
         <w:tc>
           <w:tcPr>
-            <w:tcW w:w="3560" w:type="dxa"/>
-            <w:tcBorders>
-              <w:top w:val="single" w:sz="1" w:space="0" w:color="CCCCCC"/>
-              <w:left w:val="single" w:sz="1" w:space="0" w:color="CCCCCC"/>
-              <w:bottom w:val="single" w:sz="1" w:space="0" w:color="CCCCCC"/>
-              <w:right w:val="single" w:sz="1" w:space="0" w:color="CCCCCC"/>
-            </w:tcBorders>
-            <w:shd w:val="clear" w:color="auto" w:fill="D9F0E5"/>
-            <w:tcMar>
-              <w:top w:w="60" w:type="dxa"/>
-              <w:left w:w="120" w:type="dxa"/>
-              <w:bottom w:w="60" w:type="dxa"/>
-              <w:right w:w="120" w:type="dxa"/>
-            </w:tcMar>
-            <w:vAlign w:val="center"/>
-          </w:tcPr>
-          <w:p>
-            <w:r>
-              <w:rPr>
-                <w:color w:val="000000"/>
-                <w:sz w:val="20"/>
-                <w:szCs w:val="20"/>
-              </w:rPr>
-              <w:t>Análisis completo con SNAP/Python/GEE. Presentación oral 5 min + preguntas. Informe escrito.</w:t>
+            <w:tcW w:type="dxa" w:w="3560"/>
+          </w:tcPr>
+          <w:p>
+            <w:r>
+              <w:t>Formato MDPI (journal Remote Sensing, sin secciones administrativas). Individual. Entrega 1 semana después de S6.</w:t>
             </w:r>
           </w:p>
         </w:tc>
@@ -9349,6 +9177,30 @@
             </w:r>
           </w:p>
         </w:tc>
+        <w:tc>
+          <w:tcPr>
+            <w:tcW w:w="1800" w:type="dxa"/>
+            <w:tcBorders>
+              <w:top w:val="single" w:sz="1" w:space="0" w:color="CCCCCC"/>
+              <w:left w:val="single" w:sz="1" w:space="0" w:color="CCCCCC"/>
+              <w:bottom w:val="single" w:sz="1" w:space="0" w:color="CCCCCC"/>
+              <w:right w:val="single" w:sz="1" w:space="0" w:color="CCCCCC"/>
+            </w:tcBorders>
+            <w:shd w:val="clear" w:color="auto" w:fill="1F3864"/>
+            <w:tcMar>
+              <w:top w:w="80" w:type="dxa"/>
+              <w:left w:w="120" w:type="dxa"/>
+              <w:bottom w:w="80" w:type="dxa"/>
+              <w:right w:w="120" w:type="dxa"/>
+            </w:tcMar>
+            <w:vAlign w:val="center"/>
+          </w:tcPr>
+          <w:p>
+            <w:r>
+              <w:t>Se evalúa en</w:t>
+            </w:r>
+          </w:p>
+        </w:tc>
       </w:tr>
       <w:tr>
         <w:tblPrEx>
@@ -9504,6 +9356,30 @@
             </w:r>
           </w:p>
         </w:tc>
+        <w:tc>
+          <w:tcPr>
+            <w:tcW w:w="1800" w:type="dxa"/>
+            <w:tcBorders>
+              <w:top w:val="single" w:sz="1" w:space="0" w:color="CCCCCC"/>
+              <w:left w:val="single" w:sz="1" w:space="0" w:color="CCCCCC"/>
+              <w:bottom w:val="single" w:sz="1" w:space="0" w:color="CCCCCC"/>
+              <w:right w:val="single" w:sz="1" w:space="0" w:color="CCCCCC"/>
+            </w:tcBorders>
+            <w:shd w:val="clear" w:color="auto" w:fill="F2F2F2"/>
+            <w:tcMar>
+              <w:top w:w="60" w:type="dxa"/>
+              <w:left w:w="120" w:type="dxa"/>
+              <w:bottom w:w="60" w:type="dxa"/>
+              <w:right w:w="120" w:type="dxa"/>
+            </w:tcMar>
+            <w:vAlign w:val="center"/>
+          </w:tcPr>
+          <w:p>
+            <w:r>
+              <w:t>Artículo</w:t>
+            </w:r>
+          </w:p>
+        </w:tc>
       </w:tr>
       <w:tr>
         <w:tblPrEx>
@@ -9660,6 +9536,30 @@
             </w:r>
           </w:p>
         </w:tc>
+        <w:tc>
+          <w:tcPr>
+            <w:tcW w:w="1800" w:type="dxa"/>
+            <w:tcBorders>
+              <w:top w:val="single" w:sz="1" w:space="0" w:color="CCCCCC"/>
+              <w:left w:val="single" w:sz="1" w:space="0" w:color="CCCCCC"/>
+              <w:bottom w:val="single" w:sz="1" w:space="0" w:color="CCCCCC"/>
+              <w:right w:val="single" w:sz="1" w:space="0" w:color="CCCCCC"/>
+            </w:tcBorders>
+            <w:shd w:val="clear" w:color="auto" w:fill="FFFFFF"/>
+            <w:tcMar>
+              <w:top w:w="60" w:type="dxa"/>
+              <w:left w:w="120" w:type="dxa"/>
+              <w:bottom w:w="60" w:type="dxa"/>
+              <w:right w:w="120" w:type="dxa"/>
+            </w:tcMar>
+            <w:vAlign w:val="center"/>
+          </w:tcPr>
+          <w:p>
+            <w:r>
+              <w:t>Artículo</w:t>
+            </w:r>
+          </w:p>
+        </w:tc>
       </w:tr>
       <w:tr>
         <w:tblPrEx>
@@ -9815,6 +9715,30 @@
             </w:r>
           </w:p>
         </w:tc>
+        <w:tc>
+          <w:tcPr>
+            <w:tcW w:w="1800" w:type="dxa"/>
+            <w:tcBorders>
+              <w:top w:val="single" w:sz="1" w:space="0" w:color="CCCCCC"/>
+              <w:left w:val="single" w:sz="1" w:space="0" w:color="CCCCCC"/>
+              <w:bottom w:val="single" w:sz="1" w:space="0" w:color="CCCCCC"/>
+              <w:right w:val="single" w:sz="1" w:space="0" w:color="CCCCCC"/>
+            </w:tcBorders>
+            <w:shd w:val="clear" w:color="auto" w:fill="F2F2F2"/>
+            <w:tcMar>
+              <w:top w:w="60" w:type="dxa"/>
+              <w:left w:w="120" w:type="dxa"/>
+              <w:bottom w:w="60" w:type="dxa"/>
+              <w:right w:w="120" w:type="dxa"/>
+            </w:tcMar>
+            <w:vAlign w:val="center"/>
+          </w:tcPr>
+          <w:p>
+            <w:r>
+              <w:t>Artículo</w:t>
+            </w:r>
+          </w:p>
+        </w:tc>
       </w:tr>
       <w:tr>
         <w:tblPrEx>
@@ -9970,6 +9894,30 @@
             </w:r>
           </w:p>
         </w:tc>
+        <w:tc>
+          <w:tcPr>
+            <w:tcW w:w="1800" w:type="dxa"/>
+            <w:tcBorders>
+              <w:top w:val="single" w:sz="1" w:space="0" w:color="CCCCCC"/>
+              <w:left w:val="single" w:sz="1" w:space="0" w:color="CCCCCC"/>
+              <w:bottom w:val="single" w:sz="1" w:space="0" w:color="CCCCCC"/>
+              <w:right w:val="single" w:sz="1" w:space="0" w:color="CCCCCC"/>
+            </w:tcBorders>
+            <w:shd w:val="clear" w:color="auto" w:fill="FFFFFF"/>
+            <w:tcMar>
+              <w:top w:w="60" w:type="dxa"/>
+              <w:left w:w="120" w:type="dxa"/>
+              <w:bottom w:w="60" w:type="dxa"/>
+              <w:right w:w="120" w:type="dxa"/>
+            </w:tcMar>
+            <w:vAlign w:val="center"/>
+          </w:tcPr>
+          <w:p>
+            <w:r>
+              <w:t>Presentación</w:t>
+            </w:r>
+          </w:p>
+        </w:tc>
       </w:tr>
       <w:tr>
         <w:tblPrEx>
@@ -10122,6 +10070,30 @@
                 <w:szCs w:val="20"/>
               </w:rPr>
               <w:t>Sin conexión a problemas reales</w:t>
+            </w:r>
+          </w:p>
+        </w:tc>
+        <w:tc>
+          <w:tcPr>
+            <w:tcW w:w="1800" w:type="dxa"/>
+            <w:tcBorders>
+              <w:top w:val="single" w:sz="1" w:space="0" w:color="CCCCCC"/>
+              <w:left w:val="single" w:sz="1" w:space="0" w:color="CCCCCC"/>
+              <w:bottom w:val="single" w:sz="1" w:space="0" w:color="CCCCCC"/>
+              <w:right w:val="single" w:sz="1" w:space="0" w:color="CCCCCC"/>
+            </w:tcBorders>
+            <w:shd w:val="clear" w:color="auto" w:fill="F2F2F2"/>
+            <w:tcMar>
+              <w:top w:w="60" w:type="dxa"/>
+              <w:left w:w="120" w:type="dxa"/>
+              <w:bottom w:w="60" w:type="dxa"/>
+              <w:right w:w="120" w:type="dxa"/>
+            </w:tcMar>
+            <w:vAlign w:val="center"/>
+          </w:tcPr>
+          <w:p>
+            <w:r>
+              <w:t>Artículo</w:t>
             </w:r>
           </w:p>
         </w:tc>

</xml_diff>